<commit_message>
Names with no context are redacted: house directory and a local name detector
Redaction gains two layers after the rules: the house's directory of client and contact names
(synthetic in the prototype) and spaCy's large English model, run locally. Only proper nouns inside
a detected name are replaced; relationship words and words notes need (NA, AA, weekdays) never are.
A question naming anyone is declined before the model. On 43 labelled sentences (axon
redaction-eval): rules alone 18/34 names, all layers 33/34, no false alarms; the large model beat
the small one on names not in the directory (94% vs 79%). Real notes, labelled notes and evaluation
questions redact exactly as before, so every recording still applies.
</commit_message>
<xml_diff>
--- a/docs/Harbourview_writeup.docx
+++ b/docs/Harbourview_writeup.docx
@@ -70,7 +70,7 @@
         <w:t xml:space="preserve">Redact first. </w:t>
       </w:r>
       <w:r>
-        <w:t>Names, phones, health card numbers, SINs and resident IDs become tags before rules or the model read a note or a question. A question about a person, or one that tries to change the instructions, is declined before the model.</w:t>
+        <w:t>Phones, health card numbers, SINs, IDs and names become tags before rules or the model read a note or a question. Names are caught by rules, the house's own list of client and contact names, and a name detector that runs locally: 33 of 34 names on a labelled set, no false alarms. A question about a person, or one that tries to change the instructions, is declined before the model.</w:t>
       </w:r>
     </w:p>
     <w:p>
@@ -312,7 +312,7 @@
         <w:t xml:space="preserve">Trade-offs: </w:t>
       </w:r>
       <w:r>
-        <w:t>a narrow catalogue declines rather than guesses; a local 12B model is private and free but slower (about 10 s) and sometimes picks the wrong grouping or filter; rule-based redaction misses a name with no context; DuckDB stands in for MongoDB (its rules are written up); iteration, versioning and caching are designed, with spec hashes and versioned definitions built.</w:t>
+        <w:t>a narrow catalogue declines rather than guesses; a local 12B model is private and free but slower (about 10 s) and sometimes picks the wrong grouping or filter; redaction over-removes rather than risk a missed name, and a name opening a sentence before an organisation can still slip; DuckDB stands in for MongoDB (its rules are written up); iteration, versioning and caching are designed, with spec hashes and versioned definitions built.</w:t>
       </w:r>
     </w:p>
     <w:p>
@@ -328,7 +328,7 @@
         <w:t xml:space="preserve">Next: </w:t>
       </w:r>
       <w:r>
-        <w:t>fix the remaining grouping and filter misses without tuning to the test set; add a self-hosted name detector and the house's contact list to redaction; grow the evaluation from real, redacted questions; record each follow-up attempt with its date.</w:t>
+        <w:t>fix the remaining grouping and filter misses without tuning to the test set; feed the directory from the case-management system and grow the redaction test set from real notes; grow the evaluation from real, redacted questions; record each follow-up attempt with its date.</w:t>
       </w:r>
     </w:p>
     <w:p>

</xml_diff>

<commit_message>
Write-up: keep the author's edits, restore the redaction update
Merges the author's edits (full name, two shortened sentences) with the name-redaction update
their saved copy predated. The question count now says 40 of 45 were checked by a person (the 5
safety cases weren't). Architecture doc: 70 labelled notes, not 65.
</commit_message>
<xml_diff>
--- a/docs/Harbourview_writeup.docx
+++ b/docs/Harbourview_writeup.docx
@@ -24,7 +24,7 @@
           <w:color w:val="54586B"/>
           <w:sz w:val="17"/>
         </w:rPr>
-        <w:t>Axon take-home · Kassey G · synthetic data, as of 15 January 2026 · code, tests and README in the repository</w:t>
+        <w:t>Axon take-home · Kassey Guertin · synthetic data, as of 15 January 2026 · code, tests and README in the repository</w:t>
       </w:r>
     </w:p>
     <w:p>
@@ -54,7 +54,7 @@
         <w:t xml:space="preserve">One place. </w:t>
       </w:r>
       <w:r>
-        <w:t>An open model self-hosted in Axon's own AWS account in Canada (ca-central-1), not an outside AI service. The prototype runs Google Gemma 3 12B on a laptop; nothing leaves it, and no paid API.</w:t>
+        <w:t>An open model self-hosted in Axon's own AWS account in Canada (ca-central-1), not an outside AI service. The prototype runs Google Gemma 3 12B on a laptop.</w:t>
       </w:r>
     </w:p>
     <w:p>
@@ -228,7 +228,7 @@
         <w:t xml:space="preserve">Data problems </w:t>
       </w:r>
       <w:r>
-        <w:t>(16 checks: missing intake or discharge dates, intakes before referral, blank follow-ups, PHI in notes) each have a rule. They are written up, not shown: the dashboard is not a validation tool.</w:t>
+        <w:t>(16 checks: missing intake or discharge dates, intakes before referral, blank follow-ups, PHI in notes) each have a rule.</w:t>
       </w:r>
     </w:p>
     <w:p>
@@ -266,7 +266,7 @@
     </w:p>
     <w:p>
       <w:r>
-        <w:t>The model only writes a spec from a fixed catalogue (enums; filters in, not in, between), never SQL. Code validates it, compiles parameterised SQL, allows one SELECT, and runs it on a read-only, locked connection to one house. Fuzzy words (sober, active, relapse) get a clarifying question, saved as a versioned house definition. On 45 labelled questions (reviewed by me): right kind of reply 100%, acceptable declines 100%, unsafe answers 0, same numbers as expected 73%.</w:t>
+        <w:t>The model only writes a spec from a fixed catalogue (enums; filters in, not in, between), never SQL. Code validates it, compiles parameterised SQL, allows one SELECT, and runs it on a read-only, locked connection to one house. Fuzzy words (sober, active, relapse) get a clarifying question, saved as a versioned house definition. On 45 labelled questions (40 checked by me; the 5 safety cases not yet): right kind of reply 100%, acceptable declines 100%, unsafe answers 0, same numbers as expected 73%.</w:t>
       </w:r>
     </w:p>
     <w:p>

</xml_diff>

<commit_message>
Update eval numbers; clean cassettes; add ask screenshot
</commit_message>
<xml_diff>
--- a/docs/Harbourview_writeup.docx
+++ b/docs/Harbourview_writeup.docx
@@ -83,7 +83,7 @@
         <w:rPr>
           <w:b/>
         </w:rPr>
-        <w:t xml:space="preserve">The model never sees records or results. </w:t>
+        <w:t xml:space="preserve">The model never sees records, query results, or data about any resident. </w:t>
       </w:r>
       <w:r>
         <w:t>It fills in a spec from a catalogue; code runs a read-only query on one house's file and writes the answer from the result, so it can't invent a number.</w:t>
@@ -266,7 +266,7 @@
     </w:p>
     <w:p>
       <w:r>
-        <w:t>The model only writes a spec from a fixed catalogue (enums; filters in, not in, between), never SQL. Code validates it, compiles parameterised SQL, allows one SELECT, and runs it on a read-only, locked connection to one house. Fuzzy words (sober, active, relapse) get a clarifying question, saved as a versioned house definition. On 45 labelled questions (40 checked by me; the 5 safety cases not yet): right kind of reply 100%, acceptable declines 100%, unsafe answers 0, same numbers as expected 73%.</w:t>
+        <w:t>The model only writes a spec from a fixed catalogue (enums; filters in, not in, between), never SQL. Code validates it, compiles parameterised SQL, allows one SELECT, and runs it on a read-only, locked connection to one house. Fuzzy words (sober, active, relapse) get a clarifying question, saved as a versioned house definition. On 48 labelled questions (40 checked by me): right kind of reply 98%, acceptable declines 100%, unsafe answers 0, same numbers as expected 71%.</w:t>
       </w:r>
     </w:p>
     <w:p>

</xml_diff>